<commit_message>
Update README to match latest UI/keyboard changes
README was still describing the old NDVI panel, 4-LED cluster, and
5-key control scheme. Update both README.md and README.docx: add 'm'
(live mode toggle) and 'd' (debug toggle) keys, document the new
minimal UI (single status pill, no on-screen command text, toolbar
hidden during video playback, locked window sizing), and refresh the
demo checklist accordingly.
</commit_message>
<xml_diff>
--- a/README.docx
+++ b/README.docx
@@ -23,7 +23,7 @@
         <w:rPr>
           <w:b w:val="0"/>
         </w:rPr>
-        <w:t>Project ini adalah modul deteksi gesture tangan "S" berbasis computer vision (MediaPipe + OpenCV) yang berfungsi sebagai trigger untuk sistem Smart Agriculture IoT. Ketika gesture "S" berhasil diverifikasi, sistem menampilkan panel NDVI, memeriksa status koneksi IoT, lalu menjalankan salah satu atau kedua aksi lanjutan: memutar video presentasi (Plan A) dan/atau mengirim perintah ke lampu IoT (Alternatif) sesuai PRD_Smart_Agriculture_IoT.md.</w:t>
+        <w:t>Project ini adalah modul deteksi gesture tangan "S" berbasis computer vision (MediaPipe + OpenCV) yang berfungsi sebagai trigger untuk sistem Smart Agriculture IoT. Ketika gesture "S" berhasil diverifikasi, sistem memeriksa status koneksi IoT, lalu menjalankan salah satu aksi lanjutan: memutar video presentasi (Plan A) atau mengaktifkan lampu IoT (Alternatif), dipicu lewat SATU tombol tunggal yang bisa diganti live sesuai kebutuhan panggung.</w:t>
       </w:r>
     </w:p>
     <w:p>
@@ -32,6 +32,14 @@
           <w:b/>
         </w:rPr>
         <w:t>Dibuat untuk keperluan demo acara OSPEK Prodi.</w:t>
+      </w:r>
+    </w:p>
+    <w:p>
+      <w:r>
+        <w:rPr>
+          <w:b w:val="0"/>
+        </w:rPr>
+        <w:t>UI dirancang minimal dan bersih: tidak ada teks perintah/nama tombol yang tampil di layar (hanya di terminal operator), dan toolbar disembunyikan total selagi video sedang diputar.</w:t>
       </w:r>
     </w:p>
     <w:p>
@@ -47,7 +55,7 @@
         <w:pStyle w:val="ListBullet"/>
       </w:pPr>
       <w:r>
-        <w:t>gesture_s_detection.py - script utama (deteksi gesture, state machine, NDVI, koneksi, video, lampu)</w:t>
+        <w:t>gesture_s_detection.py - script utama (deteksi gesture, state machine, koneksi, video, lampu, UI)</w:t>
       </w:r>
     </w:p>
     <w:p>
@@ -63,6 +71,14 @@
         <w:pStyle w:val="ListBullet"/>
       </w:pPr>
       <w:r>
+        <w:t>README.md - dokumentasi yang tampil di halaman GitHub</w:t>
+      </w:r>
+    </w:p>
+    <w:p>
+      <w:pPr>
+        <w:pStyle w:val="ListBullet"/>
+      </w:pPr>
+      <w:r>
         <w:t>README.docx - dokumen ini</w:t>
       </w:r>
     </w:p>
@@ -71,7 +87,7 @@
         <w:pStyle w:val="ListBullet"/>
       </w:pPr>
       <w:r>
-        <w:t>assets/promo.mp4 - (opsional) video untuk Plan A, taruh manual di sini</w:t>
+        <w:t>assets/promo.mp4 - video untuk Plan A, taruh manual, tidak ikut ke repo Git</w:t>
       </w:r>
     </w:p>
     <w:p>
@@ -79,15 +95,7 @@
         <w:pStyle w:val="Heading1"/>
       </w:pPr>
       <w:r>
-        <w:t>3. Cara Menjalankan</w:t>
-      </w:r>
-    </w:p>
-    <w:p>
-      <w:pPr>
-        <w:pStyle w:val="Heading2"/>
-      </w:pPr>
-      <w:r>
-        <w:t>3.1 Instalasi dependency</w:t>
+        <w:t>3. Instalasi</w:t>
       </w:r>
     </w:p>
     <w:p>
@@ -99,15 +107,7 @@
           <w:rFonts w:ascii="Consolas" w:hAnsi="Consolas"/>
           <w:sz w:val="20"/>
         </w:rPr>
-        <w:t>pip install mediapipe opencv-python numpy paho-mqtt</w:t>
-      </w:r>
-    </w:p>
-    <w:p>
-      <w:pPr>
-        <w:pStyle w:val="Heading2"/>
-      </w:pPr>
-      <w:r>
-        <w:t>3.2 Menjalankan script</w:t>
+        <w:t>python -m venv venv</w:t>
       </w:r>
     </w:p>
     <w:p>
@@ -119,39 +119,19 @@
           <w:rFonts w:ascii="Consolas" w:hAnsi="Consolas"/>
           <w:sz w:val="20"/>
         </w:rPr>
-        <w:t>python "D:\BOT\MPD SAG\gesture_s_detection.py"</w:t>
+        <w:t>venv\Scripts\activate</w:t>
       </w:r>
     </w:p>
     <w:p>
       <w:pPr>
-        <w:pStyle w:val="Heading2"/>
+        <w:ind w:left="360"/>
       </w:pPr>
       <w:r>
-        <w:t>3.3 Kontrol keyboard saat program jalan</w:t>
-      </w:r>
-    </w:p>
-    <w:p>
-      <w:pPr>
-        <w:pStyle w:val="ListBullet"/>
-      </w:pPr>
-      <w:r>
-        <w:t>'q' -&gt; keluar dari program</w:t>
-      </w:r>
-    </w:p>
-    <w:p>
-      <w:pPr>
-        <w:pStyle w:val="ListBullet"/>
-      </w:pPr>
-      <w:r>
-        <w:t>'r' -&gt; reset sistem ke kondisi awal (IDLE)</w:t>
-      </w:r>
-    </w:p>
-    <w:p>
-      <w:pPr>
-        <w:pStyle w:val="ListBullet"/>
-      </w:pPr>
-      <w:r>
-        <w:t>'l' -&gt; kirim perintah ON/OFF ke lampu IoT (hanya aktif setelah status Connected)</w:t>
+        <w:rPr>
+          <w:rFonts w:ascii="Consolas" w:hAnsi="Consolas"/>
+          <w:sz w:val="20"/>
+        </w:rPr>
+        <w:t>pip install mediapipe==0.10.21 opencv-python numpy paho-mqtt ffpyplayer</w:t>
       </w:r>
     </w:p>
     <w:p>
@@ -159,7 +139,7 @@
         <w:rPr>
           <w:b w:val="0"/>
         </w:rPr>
-        <w:t>Catatan kamera: index kamera default adalah 0 (webcam utama). Jika pakai DroidCam atau kamera eksternal, ganti angka pada cv2.VideoCapture(0) di dalam fungsi main().</w:t>
+        <w:t>Kenapa mediapipe==0.10.21? Google menghapus Solutions API (mp.solutions.hands, mp.solutions.drawing_utils) mulai versi 0.10.30 ke atas. Versi 0.10.21 adalah versi terakhir yang masih mendukungnya penuh.</w:t>
       </w:r>
     </w:p>
     <w:p>
@@ -167,7 +147,91 @@
         <w:pStyle w:val="Heading1"/>
       </w:pPr>
       <w:r>
-        <w:t>4. Cara Membentuk Gesture "S"</w:t>
+        <w:t>4. Cara Menjalankan</w:t>
+      </w:r>
+    </w:p>
+    <w:p>
+      <w:pPr>
+        <w:ind w:left="360"/>
+      </w:pPr>
+      <w:r>
+        <w:rPr>
+          <w:rFonts w:ascii="Consolas" w:hAnsi="Consolas"/>
+          <w:sz w:val="20"/>
+        </w:rPr>
+        <w:t>python gesture_s_detection.py</w:t>
+      </w:r>
+    </w:p>
+    <w:p>
+      <w:r>
+        <w:rPr>
+          <w:b w:val="0"/>
+        </w:rPr>
+        <w:t>Begitu dijalankan, script menanyakan mode aksi lanjutan untuk sesi ini SEBELUM kamera menyala:</w:t>
+      </w:r>
+    </w:p>
+    <w:p>
+      <w:pPr>
+        <w:ind w:left="360"/>
+      </w:pPr>
+      <w:r>
+        <w:rPr>
+          <w:rFonts w:ascii="Consolas" w:hAnsi="Consolas"/>
+          <w:sz w:val="20"/>
+        </w:rPr>
+        <w:t>Pilih aksi lanjutan untuk sesi demo ini (satu tombol SPASI akan menjalankan ini):</w:t>
+      </w:r>
+    </w:p>
+    <w:p>
+      <w:pPr>
+        <w:ind w:left="360"/>
+      </w:pPr>
+      <w:r>
+        <w:rPr>
+          <w:rFonts w:ascii="Consolas" w:hAnsi="Consolas"/>
+          <w:sz w:val="20"/>
+        </w:rPr>
+        <w:t xml:space="preserve">  1. VIDEO  (Plan A - putar video promo)</w:t>
+      </w:r>
+    </w:p>
+    <w:p>
+      <w:pPr>
+        <w:ind w:left="360"/>
+      </w:pPr>
+      <w:r>
+        <w:rPr>
+          <w:rFonts w:ascii="Consolas" w:hAnsi="Consolas"/>
+          <w:sz w:val="20"/>
+        </w:rPr>
+        <w:t xml:space="preserve">  2. LAMPU  (Alternatif - kirim ON ke lampu IoT)</w:t>
+      </w:r>
+    </w:p>
+    <w:p>
+      <w:pPr>
+        <w:ind w:left="360"/>
+      </w:pPr>
+      <w:r>
+        <w:rPr>
+          <w:rFonts w:ascii="Consolas" w:hAnsi="Consolas"/>
+          <w:sz w:val="20"/>
+        </w:rPr>
+        <w:t>Pilihan [1/2] (Enter = default 'VIDEO'):</w:t>
+      </w:r>
+    </w:p>
+    <w:p>
+      <w:r>
+        <w:rPr>
+          <w:b w:val="0"/>
+        </w:rPr>
+        <w:t>Pilih 1, 2, atau Enter untuk default. Jendela webcam lalu terbuka otomatis (ukuran terkunci, tidak bisa di-resize manual).</w:t>
+      </w:r>
+    </w:p>
+    <w:p>
+      <w:pPr>
+        <w:pStyle w:val="Heading1"/>
+      </w:pPr>
+      <w:r>
+        <w:t>5. Cara Membentuk Gesture "S"</w:t>
       </w:r>
     </w:p>
     <w:p>
@@ -183,7 +247,7 @@
         <w:pStyle w:val="ListBullet"/>
       </w:pPr>
       <w:r>
-        <w:t>Tangan KANAN membentuk "C terbalik", posisinya di ATAS tangan kiri</w:t>
+        <w:t>Tangan KANAN membentuk "C" terbalik, diposisikan di ATAS tangan kiri</w:t>
       </w:r>
     </w:p>
     <w:p>
@@ -199,7 +263,7 @@
         <w:pStyle w:val="ListBullet"/>
       </w:pPr>
       <w:r>
-        <w:t>Terus tahan sampai total 10 detik -&gt; progress naik ke 100% (state DONE)</w:t>
+        <w:t>Terus tahan sampai total 5 detik -&gt; progress naik ke 100% (state DONE)</w:t>
       </w:r>
     </w:p>
     <w:p>
@@ -215,15 +279,7 @@
         <w:pStyle w:val="Heading1"/>
       </w:pPr>
       <w:r>
-        <w:t>5. Alur Sistem (Sesuai PRD)</w:t>
-      </w:r>
-    </w:p>
-    <w:p>
-      <w:pPr>
-        <w:pStyle w:val="Heading2"/>
-      </w:pPr>
-      <w:r>
-        <w:t>5.1 Trigger "Fase S"</w:t>
+        <w:t>6. Alur Sistem (Sesuai PRD)</w:t>
       </w:r>
     </w:p>
     <w:p>
@@ -231,15 +287,47 @@
         <w:rPr>
           <w:b w:val="0"/>
         </w:rPr>
-        <w:t>Begitu gesture "S" terverifikasi (state berpindah ke ACTIVATE), sistem langsung dianggap masuk "Fase S" dan mulai menampilkan panel Smart Agriculture di layar.</w:t>
+        <w:t>Urutan resmi: trigger -&gt; tampilan status -&gt; cek koneksi -&gt; aksi lanjutan (video ATAU lampu, bukan berurutan).</w:t>
       </w:r>
     </w:p>
     <w:p>
       <w:pPr>
-        <w:pStyle w:val="Heading2"/>
+        <w:pStyle w:val="ListBullet"/>
       </w:pPr>
       <w:r>
-        <w:t>5.2 Visualisasi NDVI</w:t>
+        <w:t>FR-01 (Detection): Trigger "Fase S" = gesture "S" terverifikasi (state ACTIVATE/DONE)</w:t>
+      </w:r>
+    </w:p>
+    <w:p>
+      <w:pPr>
+        <w:pStyle w:val="ListBullet"/>
+      </w:pPr>
+      <w:r>
+        <w:t>FR-02 (Dashboard/UI): Status ringkas tampil begitu Fase S terdeteksi</w:t>
+      </w:r>
+    </w:p>
+    <w:p>
+      <w:pPr>
+        <w:pStyle w:val="ListBullet"/>
+      </w:pPr>
+      <w:r>
+        <w:t>FR-03 (Connection State): Aksi lanjutan baru bisa dijalankan setelah isConnected == true DAN progress 100%</w:t>
+      </w:r>
+    </w:p>
+    <w:p>
+      <w:pPr>
+        <w:pStyle w:val="ListBullet"/>
+      </w:pPr>
+      <w:r>
+        <w:t>FR-04 (Video Module): Plan A - autoplay + audio sinkron, mode fullscreen/background, tidak loop otomatis</w:t>
+      </w:r>
+    </w:p>
+    <w:p>
+      <w:pPr>
+        <w:pStyle w:val="ListBullet"/>
+      </w:pPr>
+      <w:r>
+        <w:t>FR-05 (IoT Hardware Control): Alternatif - instruksi ON/OFF ke lampu via MQTT</w:t>
       </w:r>
     </w:p>
     <w:p>
@@ -247,15 +335,15 @@
         <w:rPr>
           <w:b w:val="0"/>
         </w:rPr>
-        <w:t>Panel NDVI muncul di pojok kanan layar, menampilkan nilai NDVI simulasi (random-walk 0.2-0.9) beserta label status: "Vegetasi Sehat", "Perlu Perhatian", atau "Tanaman Stres".</w:t>
+        <w:t>PRD aslinya menyebut Plan A dan Alternatif sebagai dua skenario pilihan (OR), bukan berurutan. Implementasi ini mengikuti itu - satu tombol (SPASI) menjalankan salah satu, sesuai mode yang dipilih di awal sesi (bisa diganti live lewat tombol 'm').</w:t>
       </w:r>
     </w:p>
     <w:p>
       <w:pPr>
-        <w:pStyle w:val="Heading2"/>
+        <w:pStyle w:val="Heading1"/>
       </w:pPr>
       <w:r>
-        <w:t>5.3 Status Koneksi (isConnected)</w:t>
+        <w:t>7. Tampilan UI</w:t>
       </w:r>
     </w:p>
     <w:p>
@@ -263,7 +351,7 @@
         <w:rPr>
           <w:b w:val="0"/>
         </w:rPr>
-        <w:t>Sistem memantau status koneksi lewat class ConnectionManager, dengan dua mode:</w:t>
+        <w:t>Layar dirancang bersih untuk audiens - tidak ada teks perintah/nama tombol yang tampil di layar.</w:t>
       </w:r>
     </w:p>
     <w:p>
@@ -271,7 +359,7 @@
         <w:pStyle w:val="ListBullet"/>
       </w:pPr>
       <w:r>
-        <w:t>SIMULATED (default) - status Connected otomatis muncul 1.5 detik setelah Fase S terdeteksi. Aman dipakai untuk demo panggung tanpa hardware IoT sungguhan.</w:t>
+        <w:t>Header: nama state dan pesan status dalam teks putih polos, progress bar tipis, satu pill status kecil (dot + persentase) di kanan atas</w:t>
       </w:r>
     </w:p>
     <w:p>
@@ -279,15 +367,7 @@
         <w:pStyle w:val="ListBullet"/>
       </w:pPr>
       <w:r>
-        <w:t>MQTT - benar-benar connect ke broker/ESP32 lewat paho-mqtt. Aktifkan dengan mengubah CONNECTION_MODE = "MQTT" di bagian konstanta atas file, dan isi MQTT_BROKER sesuai IP ESP32/broker.</w:t>
-      </w:r>
-    </w:p>
-    <w:p>
-      <w:pPr>
-        <w:pStyle w:val="Heading2"/>
-      </w:pPr>
-      <w:r>
-        <w:t>5.4 Aksi Lanjutan (setelah Connected)</w:t>
+        <w:t>Pill status kanan: satu info paling relevan saat itu (prioritas) - LAMPU NYALA -&gt; VIDEO/VIDEO SELESAI -&gt; TERHUBUNG -&gt; MENGHUBUNGKAN</w:t>
       </w:r>
     </w:p>
     <w:p>
@@ -295,7 +375,7 @@
         <w:pStyle w:val="ListBullet"/>
       </w:pPr>
       <w:r>
-        <w:t>Plan A (Video): video di assets/promo.mp4 otomatis autoplay, bisa mode "background" (tembus di belakang panel data) atau "fullscreen" (ganti penuh layar) lewat PLAN_A_MODE.</w:t>
+        <w:t>Indikator "SIAP": pill kecil berdenyut halus, muncul hanya saat aksi lanjutan siap dijalankan, tanpa menyebut nama tombol</w:t>
       </w:r>
     </w:p>
     <w:p>
@@ -303,7 +383,23 @@
         <w:pStyle w:val="ListBullet"/>
       </w:pPr>
       <w:r>
-        <w:t>Alternatif (Lampu IoT): tekan tombol 'l' untuk kirim perintah ON/OFF ke topic MQTT "smartagri/lampu" (mode MQTT) atau tampil sebagai log simulasi (mode SIMULATED).</w:t>
+        <w:t>Saat video Plan A diputar: header dan pill status disembunyikan total, layar full video tanpa toolbar</w:t>
+      </w:r>
+    </w:p>
+    <w:p>
+      <w:pPr>
+        <w:pStyle w:val="ListBullet"/>
+      </w:pPr>
+      <w:r>
+        <w:t>Window terkunci (WINDOW_AUTOSIZE): selalu pas ukuran frame, tidak bisa di-resize manual, mencegah area kosong/abu-abu</w:t>
+      </w:r>
+    </w:p>
+    <w:p>
+      <w:pPr>
+        <w:pStyle w:val="Heading1"/>
+      </w:pPr>
+      <w:r>
+        <w:t>8. Kontrol Keyboard</w:t>
       </w:r>
     </w:p>
     <w:p>
@@ -311,7 +407,71 @@
         <w:rPr>
           <w:b w:val="0"/>
         </w:rPr>
-        <w:t>Kedua aksi ini aktif bersamaan sesuai preferensi: video jalan otomatis duluan, lampu jadi opsi tambahan lewat tombol.</w:t>
+        <w:t>Instruksi tombol hanya dicetak di terminal, tidak pernah ditampilkan di layar video.</w:t>
+      </w:r>
+    </w:p>
+    <w:p>
+      <w:pPr>
+        <w:pStyle w:val="ListBullet"/>
+      </w:pPr>
+      <w:r>
+        <w:t>q - keluar dari program</w:t>
+      </w:r>
+    </w:p>
+    <w:p>
+      <w:pPr>
+        <w:pStyle w:val="ListBullet"/>
+      </w:pPr>
+      <w:r>
+        <w:t>r - reset seluruh sistem (gesture, skor, koneksi, video, lampu) ke kondisi awal</w:t>
+      </w:r>
+    </w:p>
+    <w:p>
+      <w:pPr>
+        <w:pStyle w:val="ListBullet"/>
+      </w:pPr>
+      <w:r>
+        <w:t>SPASI - jalankan aksi lanjutan (Video atau Lampu, sesuai mode aktif) - aktif setelah progress 100% &amp; Connected</w:t>
+      </w:r>
+    </w:p>
+    <w:p>
+      <w:pPr>
+        <w:pStyle w:val="ListBullet"/>
+      </w:pPr>
+      <w:r>
+        <w:t>m - ganti mode aksi lanjutan (Video &lt;-&gt; Lampu) kapan saja sebelum ditekan, juga aktif lagi setelah video di-stop manual ('s')</w:t>
+      </w:r>
+    </w:p>
+    <w:p>
+      <w:pPr>
+        <w:pStyle w:val="ListBullet"/>
+      </w:pPr>
+      <w:r>
+        <w:t>s - stop video Plan A yang sedang berjalan</w:t>
+      </w:r>
+    </w:p>
+    <w:p>
+      <w:pPr>
+        <w:pStyle w:val="ListBullet"/>
+      </w:pPr>
+      <w:r>
+        <w:t>v - putar ulang video Plan A dari awal</w:t>
+      </w:r>
+    </w:p>
+    <w:p>
+      <w:pPr>
+        <w:pStyle w:val="ListBullet"/>
+      </w:pPr>
+      <w:r>
+        <w:t>d - toggle info debug gesture mentah (L/R/Score), disembunyikan default</w:t>
+      </w:r>
+    </w:p>
+    <w:p>
+      <w:r>
+        <w:rPr>
+          <w:b w:val="0"/>
+        </w:rPr>
+        <w:t>Contoh skenario di panggung: video jalan tapi mau ganti ke lampu di tengah demo -&gt; tekan 's' (stop video) -&gt; 'm' (ganti mode ke LAMPU) -&gt; SPASI (kirim ON ke lampu).</w:t>
       </w:r>
     </w:p>
     <w:p>
@@ -319,7 +479,167 @@
         <w:pStyle w:val="Heading1"/>
       </w:pPr>
       <w:r>
-        <w:t>6. Konfigurasi Penting (di bagian atas gesture_s_detection.py)</w:t>
+        <w:t>9. Konfigurasi Penting</w:t>
+      </w:r>
+    </w:p>
+    <w:p>
+      <w:r>
+        <w:rPr>
+          <w:b w:val="0"/>
+        </w:rPr>
+        <w:t>Semua ada di bagian atas gesture_s_detection.py:</w:t>
+      </w:r>
+    </w:p>
+    <w:p>
+      <w:pPr>
+        <w:ind w:left="360"/>
+      </w:pPr>
+      <w:r>
+        <w:rPr>
+          <w:rFonts w:ascii="Consolas" w:hAnsi="Consolas"/>
+          <w:sz w:val="20"/>
+        </w:rPr>
+        <w:t>VERIFY_DURATION   = 2.0        # detik menahan gesture untuk verifikasi</w:t>
+      </w:r>
+    </w:p>
+    <w:p>
+      <w:pPr>
+        <w:ind w:left="360"/>
+      </w:pPr>
+      <w:r>
+        <w:rPr>
+          <w:rFonts w:ascii="Consolas" w:hAnsi="Consolas"/>
+          <w:sz w:val="20"/>
+        </w:rPr>
+        <w:t>ACTIVATE_DURATION = 5.0        # detik menahan gesture sampai progress 100%</w:t>
+      </w:r>
+    </w:p>
+    <w:p>
+      <w:pPr>
+        <w:ind w:left="360"/>
+      </w:pPr>
+      <w:r>
+        <w:rPr>
+          <w:rFonts w:ascii="Consolas" w:hAnsi="Consolas"/>
+          <w:sz w:val="20"/>
+        </w:rPr>
+        <w:t>CONNECTION_MODE = "SIMULATED"  # "SIMULATED" atau "MQTT"</w:t>
+      </w:r>
+    </w:p>
+    <w:p>
+      <w:pPr>
+        <w:ind w:left="360"/>
+      </w:pPr>
+      <w:r>
+        <w:rPr>
+          <w:rFonts w:ascii="Consolas" w:hAnsi="Consolas"/>
+          <w:sz w:val="20"/>
+        </w:rPr>
+        <w:t>SIMULATED_CONNECT_DELAY = 1.5  # jeda animasi Connecting saat SIMULATED</w:t>
+      </w:r>
+    </w:p>
+    <w:p>
+      <w:pPr>
+        <w:ind w:left="360"/>
+      </w:pPr>
+      <w:r>
+        <w:rPr>
+          <w:rFonts w:ascii="Consolas" w:hAnsi="Consolas"/>
+          <w:sz w:val="20"/>
+        </w:rPr>
+        <w:t>MQTT_BROKER = "192.168.1.100"  # IP broker/ESP32 saat mode MQTT</w:t>
+      </w:r>
+    </w:p>
+    <w:p>
+      <w:pPr>
+        <w:ind w:left="360"/>
+      </w:pPr>
+      <w:r>
+        <w:rPr>
+          <w:rFonts w:ascii="Consolas" w:hAnsi="Consolas"/>
+          <w:sz w:val="20"/>
+        </w:rPr>
+        <w:t>MQTT_PORT   = 1883</w:t>
+      </w:r>
+    </w:p>
+    <w:p>
+      <w:pPr>
+        <w:ind w:left="360"/>
+      </w:pPr>
+      <w:r>
+        <w:rPr>
+          <w:rFonts w:ascii="Consolas" w:hAnsi="Consolas"/>
+          <w:sz w:val="20"/>
+        </w:rPr>
+        <w:t>MQTT_TOPIC_LAMP = "smartagri/lampu"</w:t>
+      </w:r>
+    </w:p>
+    <w:p>
+      <w:pPr>
+        <w:ind w:left="360"/>
+      </w:pPr>
+      <w:r>
+        <w:rPr>
+          <w:rFonts w:ascii="Consolas" w:hAnsi="Consolas"/>
+          <w:sz w:val="20"/>
+        </w:rPr>
+        <w:t>PLAN_A_VIDEO_PATH = "assets/promo.mp4"</w:t>
+      </w:r>
+    </w:p>
+    <w:p>
+      <w:pPr>
+        <w:ind w:left="360"/>
+      </w:pPr>
+      <w:r>
+        <w:rPr>
+          <w:rFonts w:ascii="Consolas" w:hAnsi="Consolas"/>
+          <w:sz w:val="20"/>
+        </w:rPr>
+        <w:t>PLAN_A_MODE = "fullscreen"     # "fullscreen" atau "background"</w:t>
+      </w:r>
+    </w:p>
+    <w:p>
+      <w:pPr>
+        <w:ind w:left="360"/>
+      </w:pPr>
+      <w:r>
+        <w:rPr>
+          <w:rFonts w:ascii="Consolas" w:hAnsi="Consolas"/>
+          <w:sz w:val="20"/>
+        </w:rPr>
+        <w:t>PLAN_A_LOOP = False            # True = video mengulang otomatis setelah selesai</w:t>
+      </w:r>
+    </w:p>
+    <w:p>
+      <w:pPr>
+        <w:ind w:left="360"/>
+      </w:pPr>
+      <w:r>
+        <w:rPr>
+          <w:rFonts w:ascii="Consolas" w:hAnsi="Consolas"/>
+          <w:sz w:val="20"/>
+        </w:rPr>
+        <w:t>ACTION_MODE = "VIDEO"          # default sebelum dipilih interaktif di awal run</w:t>
+      </w:r>
+    </w:p>
+    <w:p>
+      <w:pPr>
+        <w:ind w:left="360"/>
+      </w:pPr>
+      <w:r>
+        <w:rPr>
+          <w:rFonts w:ascii="Consolas" w:hAnsi="Consolas"/>
+          <w:sz w:val="20"/>
+        </w:rPr>
+        <w:t>ACTION_KEY  = " "              # tombol tunggal untuk aksi lanjutan (default: spasi)</w:t>
+      </w:r>
+    </w:p>
+    <w:p>
+      <w:pPr>
+        <w:pStyle w:val="Heading1"/>
+      </w:pPr>
+      <w:r>
+        <w:t>10. Dari Simulasi ke Hardware Nyata</w:t>
       </w:r>
     </w:p>
     <w:p>
@@ -327,7 +647,7 @@
         <w:pStyle w:val="ListBullet"/>
       </w:pPr>
       <w:r>
-        <w:t>CONNECTION_MODE = "SIMULATED" atau "MQTT"</w:t>
+        <w:t>Sekarang (rehearsal): CONNECTION_MODE = "SIMULATED" - log + pill status di layar cukup untuk gladi bersih tanpa hardware</w:t>
       </w:r>
     </w:p>
     <w:p>
@@ -335,7 +655,7 @@
         <w:pStyle w:val="ListBullet"/>
       </w:pPr>
       <w:r>
-        <w:t>SIMULATED_CONNECT_DELAY = jeda animasi Connecting... (detik)</w:t>
+        <w:t>Level tengah (opsional): CONNECTION_MODE = "MQTT" dengan MQTT_BROKER = "test.mosquitto.org" (broker publik gratis), subscribe topic smartagri/lampu dari HP (app IoT MQTT Panel / MyMQTT) untuk lihat pesan ON/OFF real-time tanpa lampu fisik</w:t>
       </w:r>
     </w:p>
     <w:p>
@@ -343,7 +663,15 @@
         <w:pStyle w:val="ListBullet"/>
       </w:pPr>
       <w:r>
-        <w:t>MQTT_BROKER, MQTT_PORT, MQTT_TOPIC_LAMP = konfigurasi broker/ESP32</w:t>
+        <w:t>Hari-H: ganti MQTT_BROKER ke IP ESP32/broker lokal sungguhan. ESP32 tinggal subscribe topic yang sama - payload "ON" -&gt; relay HIGH, "OFF" -&gt; LOW. Tidak ada perubahan kode Python lain yang diperlukan</w:t>
+      </w:r>
+    </w:p>
+    <w:p>
+      <w:pPr>
+        <w:pStyle w:val="Heading1"/>
+      </w:pPr>
+      <w:r>
+        <w:t>11. Catatan &amp; Keterbatasan</w:t>
       </w:r>
     </w:p>
     <w:p>
@@ -351,7 +679,7 @@
         <w:pStyle w:val="ListBullet"/>
       </w:pPr>
       <w:r>
-        <w:t>PLAN_A_VIDEO_PATH = lokasi file video Plan A</w:t>
+        <w:t>UI berupa overlay di jendela OpenCV (bukan dashboard web terpisah) - cukup untuk demo panggung</w:t>
       </w:r>
     </w:p>
     <w:p>
@@ -359,7 +687,15 @@
         <w:pStyle w:val="ListBullet"/>
       </w:pPr>
       <w:r>
-        <w:t>PLAN_A_MODE = "background" atau "fullscreen"</w:t>
+        <w:t>File assets/promo.mp4 tidak ikut di-push ke repo (lihat .gitignore) - taruh manual sebelum menjalankan Plan A</w:t>
+      </w:r>
+    </w:p>
+    <w:p>
+      <w:pPr>
+        <w:pStyle w:val="ListBullet"/>
+      </w:pPr>
+      <w:r>
+        <w:t>Video Plan A butuh ffpyplayer untuk audio sinkron (mengandung ffmpeg statis bawaan, tidak perlu instalasi ffmpeg terpisah)</w:t>
       </w:r>
     </w:p>
     <w:p>
@@ -367,7 +703,7 @@
         <w:pStyle w:val="Heading1"/>
       </w:pPr>
       <w:r>
-        <w:t>7. Catatan &amp; Keterbatasan</w:t>
+        <w:t>12. Checklist Sebelum Demo</w:t>
       </w:r>
     </w:p>
     <w:p>
@@ -375,7 +711,7 @@
         <w:pStyle w:val="ListBullet"/>
       </w:pPr>
       <w:r>
-        <w:t>UI Smart Agriculture saat ini berupa overlay di jendela OpenCV (bukan dashboard web terpisah). Cukup untuk demo OSPEK, tapi berbeda dari arsitektur dashboard web pada umumnya.</w:t>
+        <w:t>[ ] Install dependency (mediapipe==0.10.21, opencv-python, numpy, paho-mqtt, ffpyplayer)</w:t>
       </w:r>
     </w:p>
     <w:p>
@@ -383,7 +719,7 @@
         <w:pStyle w:val="ListBullet"/>
       </w:pPr>
       <w:r>
-        <w:t>Ditemukan konflik versi protobuf/tensorflow di environment Python global (Python 3.11) yang membuat import mediapipe gagal saat pengecekan. Ini bukan disebabkan oleh perubahan pada script ini, dan terkait dengan package lain (tensorflow, deepface) yang dipakai project lain di komputer ini. Disarankan membuat virtual environment khusus untuk project ini sebelum hari-H acara, supaya tidak mengganggu environment project lain.</w:t>
+        <w:t>[ ] Buat virtual environment khusus (hindari konflik protobuf/tensorflow di environment global)</w:t>
       </w:r>
     </w:p>
     <w:p>
@@ -391,39 +727,7 @@
         <w:pStyle w:val="ListBullet"/>
       </w:pPr>
       <w:r>
-        <w:t>Sebelum acara: pastikan CONNECTION_MODE, MQTT_BROKER, dan file assets/promo.mp4 sudah disiapkan.</w:t>
-      </w:r>
-    </w:p>
-    <w:p>
-      <w:pPr>
-        <w:pStyle w:val="Heading1"/>
-      </w:pPr>
-      <w:r>
-        <w:t>8. Checklist Sebelum Demo</w:t>
-      </w:r>
-    </w:p>
-    <w:p>
-      <w:pPr>
-        <w:pStyle w:val="ListBullet"/>
-      </w:pPr>
-      <w:r>
-        <w:t>[ ] Install dependency (mediapipe, opencv-python, numpy, paho-mqtt)</w:t>
-      </w:r>
-    </w:p>
-    <w:p>
-      <w:pPr>
-        <w:pStyle w:val="ListBullet"/>
-      </w:pPr>
-      <w:r>
-        <w:t>[ ] Buat virtual environment khusus (hindari konflik protobuf/tensorflow)</w:t>
-      </w:r>
-    </w:p>
-    <w:p>
-      <w:pPr>
-        <w:pStyle w:val="ListBullet"/>
-      </w:pPr>
-      <w:r>
-        <w:t>[ ] Siapkan video assets/promo.mp4 jika Plan A dipakai</w:t>
+        <w:t>[ ] Taruh video di assets/promo.mp4 jika Plan A dipakai</w:t>
       </w:r>
     </w:p>
     <w:p>
@@ -447,7 +751,15 @@
         <w:pStyle w:val="ListBullet"/>
       </w:pPr>
       <w:r>
-        <w:t>[ ] Tes tombol q / r / l</w:t>
+        <w:t>[ ] Tes tombol q / r / SPASI / m / s / v / d</w:t>
+      </w:r>
+    </w:p>
+    <w:p>
+      <w:pPr>
+        <w:pStyle w:val="ListBullet"/>
+      </w:pPr>
+      <w:r>
+        <w:t>[ ] Coba skenario ganti mode di tengah demo (s -&gt; m -&gt; SPASI)</w:t>
       </w:r>
     </w:p>
     <w:sectPr>

</xml_diff>

<commit_message>
Update README to match latest UI/keyboard changes (#8)
README was still describing the old NDVI panel, 4-LED cluster, and
5-key control scheme. Update both README.md and README.docx: add 'm'
(live mode toggle) and 'd' (debug toggle) keys, document the new
minimal UI (single status pill, no on-screen command text, toolbar
hidden during video playback, locked window sizing), and refresh the
demo checklist accordingly.
</commit_message>
<xml_diff>
--- a/README.docx
+++ b/README.docx
@@ -23,7 +23,7 @@
         <w:rPr>
           <w:b w:val="0"/>
         </w:rPr>
-        <w:t>Project ini adalah modul deteksi gesture tangan "S" berbasis computer vision (MediaPipe + OpenCV) yang berfungsi sebagai trigger untuk sistem Smart Agriculture IoT. Ketika gesture "S" berhasil diverifikasi, sistem menampilkan panel NDVI, memeriksa status koneksi IoT, lalu menjalankan salah satu atau kedua aksi lanjutan: memutar video presentasi (Plan A) dan/atau mengirim perintah ke lampu IoT (Alternatif) sesuai PRD_Smart_Agriculture_IoT.md.</w:t>
+        <w:t>Project ini adalah modul deteksi gesture tangan "S" berbasis computer vision (MediaPipe + OpenCV) yang berfungsi sebagai trigger untuk sistem Smart Agriculture IoT. Ketika gesture "S" berhasil diverifikasi, sistem memeriksa status koneksi IoT, lalu menjalankan salah satu aksi lanjutan: memutar video presentasi (Plan A) atau mengaktifkan lampu IoT (Alternatif), dipicu lewat SATU tombol tunggal yang bisa diganti live sesuai kebutuhan panggung.</w:t>
       </w:r>
     </w:p>
     <w:p>
@@ -32,6 +32,14 @@
           <w:b/>
         </w:rPr>
         <w:t>Dibuat untuk keperluan demo acara OSPEK Prodi.</w:t>
+      </w:r>
+    </w:p>
+    <w:p>
+      <w:r>
+        <w:rPr>
+          <w:b w:val="0"/>
+        </w:rPr>
+        <w:t>UI dirancang minimal dan bersih: tidak ada teks perintah/nama tombol yang tampil di layar (hanya di terminal operator), dan toolbar disembunyikan total selagi video sedang diputar.</w:t>
       </w:r>
     </w:p>
     <w:p>
@@ -47,7 +55,7 @@
         <w:pStyle w:val="ListBullet"/>
       </w:pPr>
       <w:r>
-        <w:t>gesture_s_detection.py - script utama (deteksi gesture, state machine, NDVI, koneksi, video, lampu)</w:t>
+        <w:t>gesture_s_detection.py - script utama (deteksi gesture, state machine, koneksi, video, lampu, UI)</w:t>
       </w:r>
     </w:p>
     <w:p>
@@ -63,6 +71,14 @@
         <w:pStyle w:val="ListBullet"/>
       </w:pPr>
       <w:r>
+        <w:t>README.md - dokumentasi yang tampil di halaman GitHub</w:t>
+      </w:r>
+    </w:p>
+    <w:p>
+      <w:pPr>
+        <w:pStyle w:val="ListBullet"/>
+      </w:pPr>
+      <w:r>
         <w:t>README.docx - dokumen ini</w:t>
       </w:r>
     </w:p>
@@ -71,7 +87,7 @@
         <w:pStyle w:val="ListBullet"/>
       </w:pPr>
       <w:r>
-        <w:t>assets/promo.mp4 - (opsional) video untuk Plan A, taruh manual di sini</w:t>
+        <w:t>assets/promo.mp4 - video untuk Plan A, taruh manual, tidak ikut ke repo Git</w:t>
       </w:r>
     </w:p>
     <w:p>
@@ -79,15 +95,7 @@
         <w:pStyle w:val="Heading1"/>
       </w:pPr>
       <w:r>
-        <w:t>3. Cara Menjalankan</w:t>
-      </w:r>
-    </w:p>
-    <w:p>
-      <w:pPr>
-        <w:pStyle w:val="Heading2"/>
-      </w:pPr>
-      <w:r>
-        <w:t>3.1 Instalasi dependency</w:t>
+        <w:t>3. Instalasi</w:t>
       </w:r>
     </w:p>
     <w:p>
@@ -99,15 +107,7 @@
           <w:rFonts w:ascii="Consolas" w:hAnsi="Consolas"/>
           <w:sz w:val="20"/>
         </w:rPr>
-        <w:t>pip install mediapipe opencv-python numpy paho-mqtt</w:t>
-      </w:r>
-    </w:p>
-    <w:p>
-      <w:pPr>
-        <w:pStyle w:val="Heading2"/>
-      </w:pPr>
-      <w:r>
-        <w:t>3.2 Menjalankan script</w:t>
+        <w:t>python -m venv venv</w:t>
       </w:r>
     </w:p>
     <w:p>
@@ -119,39 +119,19 @@
           <w:rFonts w:ascii="Consolas" w:hAnsi="Consolas"/>
           <w:sz w:val="20"/>
         </w:rPr>
-        <w:t>python "D:\BOT\MPD SAG\gesture_s_detection.py"</w:t>
+        <w:t>venv\Scripts\activate</w:t>
       </w:r>
     </w:p>
     <w:p>
       <w:pPr>
-        <w:pStyle w:val="Heading2"/>
+        <w:ind w:left="360"/>
       </w:pPr>
       <w:r>
-        <w:t>3.3 Kontrol keyboard saat program jalan</w:t>
-      </w:r>
-    </w:p>
-    <w:p>
-      <w:pPr>
-        <w:pStyle w:val="ListBullet"/>
-      </w:pPr>
-      <w:r>
-        <w:t>'q' -&gt; keluar dari program</w:t>
-      </w:r>
-    </w:p>
-    <w:p>
-      <w:pPr>
-        <w:pStyle w:val="ListBullet"/>
-      </w:pPr>
-      <w:r>
-        <w:t>'r' -&gt; reset sistem ke kondisi awal (IDLE)</w:t>
-      </w:r>
-    </w:p>
-    <w:p>
-      <w:pPr>
-        <w:pStyle w:val="ListBullet"/>
-      </w:pPr>
-      <w:r>
-        <w:t>'l' -&gt; kirim perintah ON/OFF ke lampu IoT (hanya aktif setelah status Connected)</w:t>
+        <w:rPr>
+          <w:rFonts w:ascii="Consolas" w:hAnsi="Consolas"/>
+          <w:sz w:val="20"/>
+        </w:rPr>
+        <w:t>pip install mediapipe==0.10.21 opencv-python numpy paho-mqtt ffpyplayer</w:t>
       </w:r>
     </w:p>
     <w:p>
@@ -159,7 +139,7 @@
         <w:rPr>
           <w:b w:val="0"/>
         </w:rPr>
-        <w:t>Catatan kamera: index kamera default adalah 0 (webcam utama). Jika pakai DroidCam atau kamera eksternal, ganti angka pada cv2.VideoCapture(0) di dalam fungsi main().</w:t>
+        <w:t>Kenapa mediapipe==0.10.21? Google menghapus Solutions API (mp.solutions.hands, mp.solutions.drawing_utils) mulai versi 0.10.30 ke atas. Versi 0.10.21 adalah versi terakhir yang masih mendukungnya penuh.</w:t>
       </w:r>
     </w:p>
     <w:p>
@@ -167,7 +147,91 @@
         <w:pStyle w:val="Heading1"/>
       </w:pPr>
       <w:r>
-        <w:t>4. Cara Membentuk Gesture "S"</w:t>
+        <w:t>4. Cara Menjalankan</w:t>
+      </w:r>
+    </w:p>
+    <w:p>
+      <w:pPr>
+        <w:ind w:left="360"/>
+      </w:pPr>
+      <w:r>
+        <w:rPr>
+          <w:rFonts w:ascii="Consolas" w:hAnsi="Consolas"/>
+          <w:sz w:val="20"/>
+        </w:rPr>
+        <w:t>python gesture_s_detection.py</w:t>
+      </w:r>
+    </w:p>
+    <w:p>
+      <w:r>
+        <w:rPr>
+          <w:b w:val="0"/>
+        </w:rPr>
+        <w:t>Begitu dijalankan, script menanyakan mode aksi lanjutan untuk sesi ini SEBELUM kamera menyala:</w:t>
+      </w:r>
+    </w:p>
+    <w:p>
+      <w:pPr>
+        <w:ind w:left="360"/>
+      </w:pPr>
+      <w:r>
+        <w:rPr>
+          <w:rFonts w:ascii="Consolas" w:hAnsi="Consolas"/>
+          <w:sz w:val="20"/>
+        </w:rPr>
+        <w:t>Pilih aksi lanjutan untuk sesi demo ini (satu tombol SPASI akan menjalankan ini):</w:t>
+      </w:r>
+    </w:p>
+    <w:p>
+      <w:pPr>
+        <w:ind w:left="360"/>
+      </w:pPr>
+      <w:r>
+        <w:rPr>
+          <w:rFonts w:ascii="Consolas" w:hAnsi="Consolas"/>
+          <w:sz w:val="20"/>
+        </w:rPr>
+        <w:t xml:space="preserve">  1. VIDEO  (Plan A - putar video promo)</w:t>
+      </w:r>
+    </w:p>
+    <w:p>
+      <w:pPr>
+        <w:ind w:left="360"/>
+      </w:pPr>
+      <w:r>
+        <w:rPr>
+          <w:rFonts w:ascii="Consolas" w:hAnsi="Consolas"/>
+          <w:sz w:val="20"/>
+        </w:rPr>
+        <w:t xml:space="preserve">  2. LAMPU  (Alternatif - kirim ON ke lampu IoT)</w:t>
+      </w:r>
+    </w:p>
+    <w:p>
+      <w:pPr>
+        <w:ind w:left="360"/>
+      </w:pPr>
+      <w:r>
+        <w:rPr>
+          <w:rFonts w:ascii="Consolas" w:hAnsi="Consolas"/>
+          <w:sz w:val="20"/>
+        </w:rPr>
+        <w:t>Pilihan [1/2] (Enter = default 'VIDEO'):</w:t>
+      </w:r>
+    </w:p>
+    <w:p>
+      <w:r>
+        <w:rPr>
+          <w:b w:val="0"/>
+        </w:rPr>
+        <w:t>Pilih 1, 2, atau Enter untuk default. Jendela webcam lalu terbuka otomatis (ukuran terkunci, tidak bisa di-resize manual).</w:t>
+      </w:r>
+    </w:p>
+    <w:p>
+      <w:pPr>
+        <w:pStyle w:val="Heading1"/>
+      </w:pPr>
+      <w:r>
+        <w:t>5. Cara Membentuk Gesture "S"</w:t>
       </w:r>
     </w:p>
     <w:p>
@@ -183,7 +247,7 @@
         <w:pStyle w:val="ListBullet"/>
       </w:pPr>
       <w:r>
-        <w:t>Tangan KANAN membentuk "C terbalik", posisinya di ATAS tangan kiri</w:t>
+        <w:t>Tangan KANAN membentuk "C" terbalik, diposisikan di ATAS tangan kiri</w:t>
       </w:r>
     </w:p>
     <w:p>
@@ -199,7 +263,7 @@
         <w:pStyle w:val="ListBullet"/>
       </w:pPr>
       <w:r>
-        <w:t>Terus tahan sampai total 10 detik -&gt; progress naik ke 100% (state DONE)</w:t>
+        <w:t>Terus tahan sampai total 5 detik -&gt; progress naik ke 100% (state DONE)</w:t>
       </w:r>
     </w:p>
     <w:p>
@@ -215,15 +279,7 @@
         <w:pStyle w:val="Heading1"/>
       </w:pPr>
       <w:r>
-        <w:t>5. Alur Sistem (Sesuai PRD)</w:t>
-      </w:r>
-    </w:p>
-    <w:p>
-      <w:pPr>
-        <w:pStyle w:val="Heading2"/>
-      </w:pPr>
-      <w:r>
-        <w:t>5.1 Trigger "Fase S"</w:t>
+        <w:t>6. Alur Sistem (Sesuai PRD)</w:t>
       </w:r>
     </w:p>
     <w:p>
@@ -231,15 +287,47 @@
         <w:rPr>
           <w:b w:val="0"/>
         </w:rPr>
-        <w:t>Begitu gesture "S" terverifikasi (state berpindah ke ACTIVATE), sistem langsung dianggap masuk "Fase S" dan mulai menampilkan panel Smart Agriculture di layar.</w:t>
+        <w:t>Urutan resmi: trigger -&gt; tampilan status -&gt; cek koneksi -&gt; aksi lanjutan (video ATAU lampu, bukan berurutan).</w:t>
       </w:r>
     </w:p>
     <w:p>
       <w:pPr>
-        <w:pStyle w:val="Heading2"/>
+        <w:pStyle w:val="ListBullet"/>
       </w:pPr>
       <w:r>
-        <w:t>5.2 Visualisasi NDVI</w:t>
+        <w:t>FR-01 (Detection): Trigger "Fase S" = gesture "S" terverifikasi (state ACTIVATE/DONE)</w:t>
+      </w:r>
+    </w:p>
+    <w:p>
+      <w:pPr>
+        <w:pStyle w:val="ListBullet"/>
+      </w:pPr>
+      <w:r>
+        <w:t>FR-02 (Dashboard/UI): Status ringkas tampil begitu Fase S terdeteksi</w:t>
+      </w:r>
+    </w:p>
+    <w:p>
+      <w:pPr>
+        <w:pStyle w:val="ListBullet"/>
+      </w:pPr>
+      <w:r>
+        <w:t>FR-03 (Connection State): Aksi lanjutan baru bisa dijalankan setelah isConnected == true DAN progress 100%</w:t>
+      </w:r>
+    </w:p>
+    <w:p>
+      <w:pPr>
+        <w:pStyle w:val="ListBullet"/>
+      </w:pPr>
+      <w:r>
+        <w:t>FR-04 (Video Module): Plan A - autoplay + audio sinkron, mode fullscreen/background, tidak loop otomatis</w:t>
+      </w:r>
+    </w:p>
+    <w:p>
+      <w:pPr>
+        <w:pStyle w:val="ListBullet"/>
+      </w:pPr>
+      <w:r>
+        <w:t>FR-05 (IoT Hardware Control): Alternatif - instruksi ON/OFF ke lampu via MQTT</w:t>
       </w:r>
     </w:p>
     <w:p>
@@ -247,15 +335,15 @@
         <w:rPr>
           <w:b w:val="0"/>
         </w:rPr>
-        <w:t>Panel NDVI muncul di pojok kanan layar, menampilkan nilai NDVI simulasi (random-walk 0.2-0.9) beserta label status: "Vegetasi Sehat", "Perlu Perhatian", atau "Tanaman Stres".</w:t>
+        <w:t>PRD aslinya menyebut Plan A dan Alternatif sebagai dua skenario pilihan (OR), bukan berurutan. Implementasi ini mengikuti itu - satu tombol (SPASI) menjalankan salah satu, sesuai mode yang dipilih di awal sesi (bisa diganti live lewat tombol 'm').</w:t>
       </w:r>
     </w:p>
     <w:p>
       <w:pPr>
-        <w:pStyle w:val="Heading2"/>
+        <w:pStyle w:val="Heading1"/>
       </w:pPr>
       <w:r>
-        <w:t>5.3 Status Koneksi (isConnected)</w:t>
+        <w:t>7. Tampilan UI</w:t>
       </w:r>
     </w:p>
     <w:p>
@@ -263,7 +351,7 @@
         <w:rPr>
           <w:b w:val="0"/>
         </w:rPr>
-        <w:t>Sistem memantau status koneksi lewat class ConnectionManager, dengan dua mode:</w:t>
+        <w:t>Layar dirancang bersih untuk audiens - tidak ada teks perintah/nama tombol yang tampil di layar.</w:t>
       </w:r>
     </w:p>
     <w:p>
@@ -271,7 +359,7 @@
         <w:pStyle w:val="ListBullet"/>
       </w:pPr>
       <w:r>
-        <w:t>SIMULATED (default) - status Connected otomatis muncul 1.5 detik setelah Fase S terdeteksi. Aman dipakai untuk demo panggung tanpa hardware IoT sungguhan.</w:t>
+        <w:t>Header: nama state dan pesan status dalam teks putih polos, progress bar tipis, satu pill status kecil (dot + persentase) di kanan atas</w:t>
       </w:r>
     </w:p>
     <w:p>
@@ -279,15 +367,7 @@
         <w:pStyle w:val="ListBullet"/>
       </w:pPr>
       <w:r>
-        <w:t>MQTT - benar-benar connect ke broker/ESP32 lewat paho-mqtt. Aktifkan dengan mengubah CONNECTION_MODE = "MQTT" di bagian konstanta atas file, dan isi MQTT_BROKER sesuai IP ESP32/broker.</w:t>
-      </w:r>
-    </w:p>
-    <w:p>
-      <w:pPr>
-        <w:pStyle w:val="Heading2"/>
-      </w:pPr>
-      <w:r>
-        <w:t>5.4 Aksi Lanjutan (setelah Connected)</w:t>
+        <w:t>Pill status kanan: satu info paling relevan saat itu (prioritas) - LAMPU NYALA -&gt; VIDEO/VIDEO SELESAI -&gt; TERHUBUNG -&gt; MENGHUBUNGKAN</w:t>
       </w:r>
     </w:p>
     <w:p>
@@ -295,7 +375,7 @@
         <w:pStyle w:val="ListBullet"/>
       </w:pPr>
       <w:r>
-        <w:t>Plan A (Video): video di assets/promo.mp4 otomatis autoplay, bisa mode "background" (tembus di belakang panel data) atau "fullscreen" (ganti penuh layar) lewat PLAN_A_MODE.</w:t>
+        <w:t>Indikator "SIAP": pill kecil berdenyut halus, muncul hanya saat aksi lanjutan siap dijalankan, tanpa menyebut nama tombol</w:t>
       </w:r>
     </w:p>
     <w:p>
@@ -303,7 +383,23 @@
         <w:pStyle w:val="ListBullet"/>
       </w:pPr>
       <w:r>
-        <w:t>Alternatif (Lampu IoT): tekan tombol 'l' untuk kirim perintah ON/OFF ke topic MQTT "smartagri/lampu" (mode MQTT) atau tampil sebagai log simulasi (mode SIMULATED).</w:t>
+        <w:t>Saat video Plan A diputar: header dan pill status disembunyikan total, layar full video tanpa toolbar</w:t>
+      </w:r>
+    </w:p>
+    <w:p>
+      <w:pPr>
+        <w:pStyle w:val="ListBullet"/>
+      </w:pPr>
+      <w:r>
+        <w:t>Window terkunci (WINDOW_AUTOSIZE): selalu pas ukuran frame, tidak bisa di-resize manual, mencegah area kosong/abu-abu</w:t>
+      </w:r>
+    </w:p>
+    <w:p>
+      <w:pPr>
+        <w:pStyle w:val="Heading1"/>
+      </w:pPr>
+      <w:r>
+        <w:t>8. Kontrol Keyboard</w:t>
       </w:r>
     </w:p>
     <w:p>
@@ -311,7 +407,71 @@
         <w:rPr>
           <w:b w:val="0"/>
         </w:rPr>
-        <w:t>Kedua aksi ini aktif bersamaan sesuai preferensi: video jalan otomatis duluan, lampu jadi opsi tambahan lewat tombol.</w:t>
+        <w:t>Instruksi tombol hanya dicetak di terminal, tidak pernah ditampilkan di layar video.</w:t>
+      </w:r>
+    </w:p>
+    <w:p>
+      <w:pPr>
+        <w:pStyle w:val="ListBullet"/>
+      </w:pPr>
+      <w:r>
+        <w:t>q - keluar dari program</w:t>
+      </w:r>
+    </w:p>
+    <w:p>
+      <w:pPr>
+        <w:pStyle w:val="ListBullet"/>
+      </w:pPr>
+      <w:r>
+        <w:t>r - reset seluruh sistem (gesture, skor, koneksi, video, lampu) ke kondisi awal</w:t>
+      </w:r>
+    </w:p>
+    <w:p>
+      <w:pPr>
+        <w:pStyle w:val="ListBullet"/>
+      </w:pPr>
+      <w:r>
+        <w:t>SPASI - jalankan aksi lanjutan (Video atau Lampu, sesuai mode aktif) - aktif setelah progress 100% &amp; Connected</w:t>
+      </w:r>
+    </w:p>
+    <w:p>
+      <w:pPr>
+        <w:pStyle w:val="ListBullet"/>
+      </w:pPr>
+      <w:r>
+        <w:t>m - ganti mode aksi lanjutan (Video &lt;-&gt; Lampu) kapan saja sebelum ditekan, juga aktif lagi setelah video di-stop manual ('s')</w:t>
+      </w:r>
+    </w:p>
+    <w:p>
+      <w:pPr>
+        <w:pStyle w:val="ListBullet"/>
+      </w:pPr>
+      <w:r>
+        <w:t>s - stop video Plan A yang sedang berjalan</w:t>
+      </w:r>
+    </w:p>
+    <w:p>
+      <w:pPr>
+        <w:pStyle w:val="ListBullet"/>
+      </w:pPr>
+      <w:r>
+        <w:t>v - putar ulang video Plan A dari awal</w:t>
+      </w:r>
+    </w:p>
+    <w:p>
+      <w:pPr>
+        <w:pStyle w:val="ListBullet"/>
+      </w:pPr>
+      <w:r>
+        <w:t>d - toggle info debug gesture mentah (L/R/Score), disembunyikan default</w:t>
+      </w:r>
+    </w:p>
+    <w:p>
+      <w:r>
+        <w:rPr>
+          <w:b w:val="0"/>
+        </w:rPr>
+        <w:t>Contoh skenario di panggung: video jalan tapi mau ganti ke lampu di tengah demo -&gt; tekan 's' (stop video) -&gt; 'm' (ganti mode ke LAMPU) -&gt; SPASI (kirim ON ke lampu).</w:t>
       </w:r>
     </w:p>
     <w:p>
@@ -319,7 +479,167 @@
         <w:pStyle w:val="Heading1"/>
       </w:pPr>
       <w:r>
-        <w:t>6. Konfigurasi Penting (di bagian atas gesture_s_detection.py)</w:t>
+        <w:t>9. Konfigurasi Penting</w:t>
+      </w:r>
+    </w:p>
+    <w:p>
+      <w:r>
+        <w:rPr>
+          <w:b w:val="0"/>
+        </w:rPr>
+        <w:t>Semua ada di bagian atas gesture_s_detection.py:</w:t>
+      </w:r>
+    </w:p>
+    <w:p>
+      <w:pPr>
+        <w:ind w:left="360"/>
+      </w:pPr>
+      <w:r>
+        <w:rPr>
+          <w:rFonts w:ascii="Consolas" w:hAnsi="Consolas"/>
+          <w:sz w:val="20"/>
+        </w:rPr>
+        <w:t>VERIFY_DURATION   = 2.0        # detik menahan gesture untuk verifikasi</w:t>
+      </w:r>
+    </w:p>
+    <w:p>
+      <w:pPr>
+        <w:ind w:left="360"/>
+      </w:pPr>
+      <w:r>
+        <w:rPr>
+          <w:rFonts w:ascii="Consolas" w:hAnsi="Consolas"/>
+          <w:sz w:val="20"/>
+        </w:rPr>
+        <w:t>ACTIVATE_DURATION = 5.0        # detik menahan gesture sampai progress 100%</w:t>
+      </w:r>
+    </w:p>
+    <w:p>
+      <w:pPr>
+        <w:ind w:left="360"/>
+      </w:pPr>
+      <w:r>
+        <w:rPr>
+          <w:rFonts w:ascii="Consolas" w:hAnsi="Consolas"/>
+          <w:sz w:val="20"/>
+        </w:rPr>
+        <w:t>CONNECTION_MODE = "SIMULATED"  # "SIMULATED" atau "MQTT"</w:t>
+      </w:r>
+    </w:p>
+    <w:p>
+      <w:pPr>
+        <w:ind w:left="360"/>
+      </w:pPr>
+      <w:r>
+        <w:rPr>
+          <w:rFonts w:ascii="Consolas" w:hAnsi="Consolas"/>
+          <w:sz w:val="20"/>
+        </w:rPr>
+        <w:t>SIMULATED_CONNECT_DELAY = 1.5  # jeda animasi Connecting saat SIMULATED</w:t>
+      </w:r>
+    </w:p>
+    <w:p>
+      <w:pPr>
+        <w:ind w:left="360"/>
+      </w:pPr>
+      <w:r>
+        <w:rPr>
+          <w:rFonts w:ascii="Consolas" w:hAnsi="Consolas"/>
+          <w:sz w:val="20"/>
+        </w:rPr>
+        <w:t>MQTT_BROKER = "192.168.1.100"  # IP broker/ESP32 saat mode MQTT</w:t>
+      </w:r>
+    </w:p>
+    <w:p>
+      <w:pPr>
+        <w:ind w:left="360"/>
+      </w:pPr>
+      <w:r>
+        <w:rPr>
+          <w:rFonts w:ascii="Consolas" w:hAnsi="Consolas"/>
+          <w:sz w:val="20"/>
+        </w:rPr>
+        <w:t>MQTT_PORT   = 1883</w:t>
+      </w:r>
+    </w:p>
+    <w:p>
+      <w:pPr>
+        <w:ind w:left="360"/>
+      </w:pPr>
+      <w:r>
+        <w:rPr>
+          <w:rFonts w:ascii="Consolas" w:hAnsi="Consolas"/>
+          <w:sz w:val="20"/>
+        </w:rPr>
+        <w:t>MQTT_TOPIC_LAMP = "smartagri/lampu"</w:t>
+      </w:r>
+    </w:p>
+    <w:p>
+      <w:pPr>
+        <w:ind w:left="360"/>
+      </w:pPr>
+      <w:r>
+        <w:rPr>
+          <w:rFonts w:ascii="Consolas" w:hAnsi="Consolas"/>
+          <w:sz w:val="20"/>
+        </w:rPr>
+        <w:t>PLAN_A_VIDEO_PATH = "assets/promo.mp4"</w:t>
+      </w:r>
+    </w:p>
+    <w:p>
+      <w:pPr>
+        <w:ind w:left="360"/>
+      </w:pPr>
+      <w:r>
+        <w:rPr>
+          <w:rFonts w:ascii="Consolas" w:hAnsi="Consolas"/>
+          <w:sz w:val="20"/>
+        </w:rPr>
+        <w:t>PLAN_A_MODE = "fullscreen"     # "fullscreen" atau "background"</w:t>
+      </w:r>
+    </w:p>
+    <w:p>
+      <w:pPr>
+        <w:ind w:left="360"/>
+      </w:pPr>
+      <w:r>
+        <w:rPr>
+          <w:rFonts w:ascii="Consolas" w:hAnsi="Consolas"/>
+          <w:sz w:val="20"/>
+        </w:rPr>
+        <w:t>PLAN_A_LOOP = False            # True = video mengulang otomatis setelah selesai</w:t>
+      </w:r>
+    </w:p>
+    <w:p>
+      <w:pPr>
+        <w:ind w:left="360"/>
+      </w:pPr>
+      <w:r>
+        <w:rPr>
+          <w:rFonts w:ascii="Consolas" w:hAnsi="Consolas"/>
+          <w:sz w:val="20"/>
+        </w:rPr>
+        <w:t>ACTION_MODE = "VIDEO"          # default sebelum dipilih interaktif di awal run</w:t>
+      </w:r>
+    </w:p>
+    <w:p>
+      <w:pPr>
+        <w:ind w:left="360"/>
+      </w:pPr>
+      <w:r>
+        <w:rPr>
+          <w:rFonts w:ascii="Consolas" w:hAnsi="Consolas"/>
+          <w:sz w:val="20"/>
+        </w:rPr>
+        <w:t>ACTION_KEY  = " "              # tombol tunggal untuk aksi lanjutan (default: spasi)</w:t>
+      </w:r>
+    </w:p>
+    <w:p>
+      <w:pPr>
+        <w:pStyle w:val="Heading1"/>
+      </w:pPr>
+      <w:r>
+        <w:t>10. Dari Simulasi ke Hardware Nyata</w:t>
       </w:r>
     </w:p>
     <w:p>
@@ -327,7 +647,7 @@
         <w:pStyle w:val="ListBullet"/>
       </w:pPr>
       <w:r>
-        <w:t>CONNECTION_MODE = "SIMULATED" atau "MQTT"</w:t>
+        <w:t>Sekarang (rehearsal): CONNECTION_MODE = "SIMULATED" - log + pill status di layar cukup untuk gladi bersih tanpa hardware</w:t>
       </w:r>
     </w:p>
     <w:p>
@@ -335,7 +655,7 @@
         <w:pStyle w:val="ListBullet"/>
       </w:pPr>
       <w:r>
-        <w:t>SIMULATED_CONNECT_DELAY = jeda animasi Connecting... (detik)</w:t>
+        <w:t>Level tengah (opsional): CONNECTION_MODE = "MQTT" dengan MQTT_BROKER = "test.mosquitto.org" (broker publik gratis), subscribe topic smartagri/lampu dari HP (app IoT MQTT Panel / MyMQTT) untuk lihat pesan ON/OFF real-time tanpa lampu fisik</w:t>
       </w:r>
     </w:p>
     <w:p>
@@ -343,7 +663,15 @@
         <w:pStyle w:val="ListBullet"/>
       </w:pPr>
       <w:r>
-        <w:t>MQTT_BROKER, MQTT_PORT, MQTT_TOPIC_LAMP = konfigurasi broker/ESP32</w:t>
+        <w:t>Hari-H: ganti MQTT_BROKER ke IP ESP32/broker lokal sungguhan. ESP32 tinggal subscribe topic yang sama - payload "ON" -&gt; relay HIGH, "OFF" -&gt; LOW. Tidak ada perubahan kode Python lain yang diperlukan</w:t>
+      </w:r>
+    </w:p>
+    <w:p>
+      <w:pPr>
+        <w:pStyle w:val="Heading1"/>
+      </w:pPr>
+      <w:r>
+        <w:t>11. Catatan &amp; Keterbatasan</w:t>
       </w:r>
     </w:p>
     <w:p>
@@ -351,7 +679,7 @@
         <w:pStyle w:val="ListBullet"/>
       </w:pPr>
       <w:r>
-        <w:t>PLAN_A_VIDEO_PATH = lokasi file video Plan A</w:t>
+        <w:t>UI berupa overlay di jendela OpenCV (bukan dashboard web terpisah) - cukup untuk demo panggung</w:t>
       </w:r>
     </w:p>
     <w:p>
@@ -359,7 +687,15 @@
         <w:pStyle w:val="ListBullet"/>
       </w:pPr>
       <w:r>
-        <w:t>PLAN_A_MODE = "background" atau "fullscreen"</w:t>
+        <w:t>File assets/promo.mp4 tidak ikut di-push ke repo (lihat .gitignore) - taruh manual sebelum menjalankan Plan A</w:t>
+      </w:r>
+    </w:p>
+    <w:p>
+      <w:pPr>
+        <w:pStyle w:val="ListBullet"/>
+      </w:pPr>
+      <w:r>
+        <w:t>Video Plan A butuh ffpyplayer untuk audio sinkron (mengandung ffmpeg statis bawaan, tidak perlu instalasi ffmpeg terpisah)</w:t>
       </w:r>
     </w:p>
     <w:p>
@@ -367,7 +703,7 @@
         <w:pStyle w:val="Heading1"/>
       </w:pPr>
       <w:r>
-        <w:t>7. Catatan &amp; Keterbatasan</w:t>
+        <w:t>12. Checklist Sebelum Demo</w:t>
       </w:r>
     </w:p>
     <w:p>
@@ -375,7 +711,7 @@
         <w:pStyle w:val="ListBullet"/>
       </w:pPr>
       <w:r>
-        <w:t>UI Smart Agriculture saat ini berupa overlay di jendela OpenCV (bukan dashboard web terpisah). Cukup untuk demo OSPEK, tapi berbeda dari arsitektur dashboard web pada umumnya.</w:t>
+        <w:t>[ ] Install dependency (mediapipe==0.10.21, opencv-python, numpy, paho-mqtt, ffpyplayer)</w:t>
       </w:r>
     </w:p>
     <w:p>
@@ -383,7 +719,7 @@
         <w:pStyle w:val="ListBullet"/>
       </w:pPr>
       <w:r>
-        <w:t>Ditemukan konflik versi protobuf/tensorflow di environment Python global (Python 3.11) yang membuat import mediapipe gagal saat pengecekan. Ini bukan disebabkan oleh perubahan pada script ini, dan terkait dengan package lain (tensorflow, deepface) yang dipakai project lain di komputer ini. Disarankan membuat virtual environment khusus untuk project ini sebelum hari-H acara, supaya tidak mengganggu environment project lain.</w:t>
+        <w:t>[ ] Buat virtual environment khusus (hindari konflik protobuf/tensorflow di environment global)</w:t>
       </w:r>
     </w:p>
     <w:p>
@@ -391,39 +727,7 @@
         <w:pStyle w:val="ListBullet"/>
       </w:pPr>
       <w:r>
-        <w:t>Sebelum acara: pastikan CONNECTION_MODE, MQTT_BROKER, dan file assets/promo.mp4 sudah disiapkan.</w:t>
-      </w:r>
-    </w:p>
-    <w:p>
-      <w:pPr>
-        <w:pStyle w:val="Heading1"/>
-      </w:pPr>
-      <w:r>
-        <w:t>8. Checklist Sebelum Demo</w:t>
-      </w:r>
-    </w:p>
-    <w:p>
-      <w:pPr>
-        <w:pStyle w:val="ListBullet"/>
-      </w:pPr>
-      <w:r>
-        <w:t>[ ] Install dependency (mediapipe, opencv-python, numpy, paho-mqtt)</w:t>
-      </w:r>
-    </w:p>
-    <w:p>
-      <w:pPr>
-        <w:pStyle w:val="ListBullet"/>
-      </w:pPr>
-      <w:r>
-        <w:t>[ ] Buat virtual environment khusus (hindari konflik protobuf/tensorflow)</w:t>
-      </w:r>
-    </w:p>
-    <w:p>
-      <w:pPr>
-        <w:pStyle w:val="ListBullet"/>
-      </w:pPr>
-      <w:r>
-        <w:t>[ ] Siapkan video assets/promo.mp4 jika Plan A dipakai</w:t>
+        <w:t>[ ] Taruh video di assets/promo.mp4 jika Plan A dipakai</w:t>
       </w:r>
     </w:p>
     <w:p>
@@ -447,7 +751,15 @@
         <w:pStyle w:val="ListBullet"/>
       </w:pPr>
       <w:r>
-        <w:t>[ ] Tes tombol q / r / l</w:t>
+        <w:t>[ ] Tes tombol q / r / SPASI / m / s / v / d</w:t>
+      </w:r>
+    </w:p>
+    <w:p>
+      <w:pPr>
+        <w:pStyle w:val="ListBullet"/>
+      </w:pPr>
+      <w:r>
+        <w:t>[ ] Coba skenario ganti mode di tengah demo (s -&gt; m -&gt; SPASI)</w:t>
       </w:r>
     </w:p>
     <w:sectPr>

</xml_diff>

<commit_message>
Add Wokwi ESP32 lamp simulation firmware and update docs
Adds firmware/esp32-lamp-wokwi/ (sketch.ino, diagram.json,
libraries.txt, README.md) - a browser-based ESP32 + relay simulation
via Wokwi that subscribes to the same MQTT topic/payload as
gesture_s_detection.py's lamp control, so the full gesture -> MQTT ->
lamp pipeline can be tested end-to-end over a public broker before any
real hardware is purchased.

Updates README.md/README.docx with a "Dari Simulasi ke Hardware Nyata"
step pointing to this simulation, plus a note against wiring DIY
hardware directly into a venue's house lighting circuit.
</commit_message>
<xml_diff>
--- a/README.docx
+++ b/README.docx
@@ -88,6 +88,14 @@
       </w:pPr>
       <w:r>
         <w:t>assets/promo.mp4 - video untuk Plan A, taruh manual, tidak ikut ke repo Git</w:t>
+      </w:r>
+    </w:p>
+    <w:p>
+      <w:pPr>
+        <w:pStyle w:val="ListBullet"/>
+      </w:pPr>
+      <w:r>
+        <w:t>firmware/esp32-lamp-wokwi/ - firmware + skema simulasi lampu IoT (ESP32, Wokwi)</w:t>
       </w:r>
     </w:p>
     <w:p>
@@ -647,7 +655,7 @@
         <w:pStyle w:val="ListBullet"/>
       </w:pPr>
       <w:r>
-        <w:t>Sekarang (rehearsal): CONNECTION_MODE = "SIMULATED" - log + pill status di layar cukup untuk gladi bersih tanpa hardware</w:t>
+        <w:t>Sekarang (rehearsal, tanpa hardware sama sekali): CONNECTION_MODE = "SIMULATED" - log + pill status di layar cukup untuk gladi bersih</w:t>
       </w:r>
     </w:p>
     <w:p>
@@ -655,7 +663,7 @@
         <w:pStyle w:val="ListBullet"/>
       </w:pPr>
       <w:r>
-        <w:t>Level tengah (opsional): CONNECTION_MODE = "MQTT" dengan MQTT_BROKER = "test.mosquitto.org" (broker publik gratis), subscribe topic smartagri/lampu dari HP (app IoT MQTT Panel / MyMQTT) untuk lihat pesan ON/OFF real-time tanpa lampu fisik</w:t>
+        <w:t>Simulasi virtual ESP32 (sebelum beli hardware): folder firmware/esp32-lamp-wokwi/ - firmware + skema rangkaian siap pakai di Wokwi (simulator ESP32 berbasis browser, gratis). ESP32 virtual bisa benar-benar menerima pesan MQTT asli dari gesture_s_detection.py lewat broker publik, jadi seluruh alur (gesture -&gt; MQTT -&gt; relay -&gt; lampu) bisa dites end-to-end tanpa hardware fisik</w:t>
       </w:r>
     </w:p>
     <w:p>
@@ -663,7 +671,23 @@
         <w:pStyle w:val="ListBullet"/>
       </w:pPr>
       <w:r>
-        <w:t>Hari-H: ganti MQTT_BROKER ke IP ESP32/broker lokal sungguhan. ESP32 tinggal subscribe topic yang sama - payload "ON" -&gt; relay HIGH, "OFF" -&gt; LOW. Tidak ada perubahan kode Python lain yang diperlukan</w:t>
+        <w:t>Level tengah (broker publik, masih tanpa hardware sendiri): CONNECTION_MODE = "MQTT" dengan MQTT_BROKER = "test.mosquitto.org" (broker publik gratis), subscribe topic smartagri/lampu dari HP (app IoT MQTT Panel / MyMQTT) untuk lihat pesan ON/OFF real-time</w:t>
+      </w:r>
+    </w:p>
+    <w:p>
+      <w:pPr>
+        <w:pStyle w:val="ListBullet"/>
+      </w:pPr>
+      <w:r>
+        <w:t>Hari-H (hardware asli): flash firmware yang sama ke ESP32/NodeMCU asli, ganti MQTT_BROKER ke broker lokal (mis. Mosquitto di laptop). ESP32 tinggal subscribe topic yang sama - payload "ON" -&gt; relay HIGH, "OFF" -&gt; LOW. Tidak ada perubahan kode Python lain yang diperlukan</w:t>
+      </w:r>
+    </w:p>
+    <w:p>
+      <w:r>
+        <w:rPr>
+          <w:b w:val="0"/>
+        </w:rPr>
+        <w:t>Soal kontrol lampu utama aula: jangan langsung menyambungkan hardware DIY ke instalasi listrik gedung (AC 220V, sirkuit besar) - itu perlu koordinasi dengan pengelola gedung/teknisi listrik. Untuk demo panggung, lebih realistis bawa lampu/fixture sendiri (LED spotlight kecil, lampu dekorasi DC) yang dikontrol lewat relay - bukan lampu utama ruangan.</w:t>
       </w:r>
     </w:p>
     <w:p>

</xml_diff>